<commit_message>
docs: Update report documents
</commit_message>
<xml_diff>
--- a/Report.docx
+++ b/Report.docx
@@ -4,545 +4,6 @@
   <w:body>
     <w:p>
       <w:pPr>
-        <w:pStyle w:val="Heading1"/>
-        <w:jc w:val="center"/>
-        <w:rPr>
-          <w:lang w:val="en-US"/>
-        </w:rPr>
-      </w:pPr>
-      <w:r>
-        <w:rPr>
-          <w:lang w:val="en-US"/>
-        </w:rPr>
-        <w:t>Group 30</w:t>
-      </w:r>
-    </w:p>
-    <w:p>
-      <w:pPr>
-        <w:rPr>
-          <w:b/>
-          <w:bCs/>
-          <w:lang w:val="en-US"/>
-        </w:rPr>
-      </w:pPr>
-    </w:p>
-    <w:tbl>
-      <w:tblPr>
-        <w:tblStyle w:val="TableGrid"/>
-        <w:tblW w:w="0" w:type="auto"/>
-        <w:tblLook w:val="04A0"/>
-      </w:tblPr>
-      <w:tblGrid>
-        <w:gridCol w:w="3080"/>
-        <w:gridCol w:w="3081"/>
-        <w:gridCol w:w="3081"/>
-      </w:tblGrid>
-      <w:tr>
-        <w:tc>
-          <w:tcPr>
-            <w:tcW w:w="3080" w:type="dxa"/>
-          </w:tcPr>
-          <w:p>
-            <w:pPr>
-              <w:rPr>
-                <w:b/>
-                <w:bCs/>
-                <w:lang w:val="en-US"/>
-              </w:rPr>
-            </w:pPr>
-            <w:r>
-              <w:rPr>
-                <w:b/>
-                <w:bCs/>
-                <w:lang w:val="en-US"/>
-              </w:rPr>
-              <w:t>Name</w:t>
-            </w:r>
-          </w:p>
-        </w:tc>
-        <w:tc>
-          <w:tcPr>
-            <w:tcW w:w="3081" w:type="dxa"/>
-          </w:tcPr>
-          <w:p>
-            <w:pPr>
-              <w:rPr>
-                <w:b/>
-                <w:bCs/>
-                <w:lang w:val="en-US"/>
-              </w:rPr>
-            </w:pPr>
-            <w:r>
-              <w:rPr>
-                <w:b/>
-                <w:bCs/>
-                <w:lang w:val="en-US"/>
-              </w:rPr>
-              <w:t>BITS ID</w:t>
-            </w:r>
-          </w:p>
-        </w:tc>
-        <w:tc>
-          <w:tcPr>
-            <w:tcW w:w="3081" w:type="dxa"/>
-          </w:tcPr>
-          <w:p>
-            <w:pPr>
-              <w:rPr>
-                <w:b/>
-                <w:bCs/>
-                <w:lang w:val="en-US"/>
-              </w:rPr>
-            </w:pPr>
-            <w:r>
-              <w:rPr>
-                <w:b/>
-                <w:bCs/>
-                <w:lang w:val="en-US"/>
-              </w:rPr>
-              <w:t>Contribution</w:t>
-            </w:r>
-          </w:p>
-        </w:tc>
-      </w:tr>
-      <w:tr>
-        <w:tc>
-          <w:tcPr>
-            <w:tcW w:w="3080" w:type="dxa"/>
-          </w:tcPr>
-          <w:p>
-            <w:pPr>
-              <w:rPr>
-                <w:b/>
-                <w:bCs/>
-                <w:lang w:val="en-US"/>
-              </w:rPr>
-            </w:pPr>
-            <w:proofErr w:type="spellStart"/>
-            <w:r>
-              <w:rPr>
-                <w:b/>
-                <w:bCs/>
-                <w:lang w:val="en-US"/>
-              </w:rPr>
-              <w:t>Sai</w:t>
-            </w:r>
-            <w:proofErr w:type="spellEnd"/>
-            <w:r>
-              <w:rPr>
-                <w:b/>
-                <w:bCs/>
-                <w:lang w:val="en-US"/>
-              </w:rPr>
-              <w:t xml:space="preserve"> Reddy N </w:t>
-            </w:r>
-          </w:p>
-        </w:tc>
-        <w:tc>
-          <w:tcPr>
-            <w:tcW w:w="3081" w:type="dxa"/>
-          </w:tcPr>
-          <w:p>
-            <w:pPr>
-              <w:rPr>
-                <w:b/>
-                <w:bCs/>
-                <w:lang w:val="en-US"/>
-              </w:rPr>
-            </w:pPr>
-            <w:r>
-              <w:rPr>
-                <w:b/>
-                <w:bCs/>
-                <w:lang w:val="en-US"/>
-              </w:rPr>
-              <w:t>2024AA05759</w:t>
-            </w:r>
-          </w:p>
-        </w:tc>
-        <w:tc>
-          <w:tcPr>
-            <w:tcW w:w="3081" w:type="dxa"/>
-          </w:tcPr>
-          <w:p>
-            <w:pPr>
-              <w:rPr>
-                <w:b/>
-                <w:bCs/>
-                <w:lang w:val="en-US"/>
-              </w:rPr>
-            </w:pPr>
-            <w:r>
-              <w:rPr>
-                <w:b/>
-                <w:bCs/>
-                <w:lang w:val="en-US"/>
-              </w:rPr>
-              <w:t>100%</w:t>
-            </w:r>
-          </w:p>
-        </w:tc>
-      </w:tr>
-      <w:tr>
-        <w:tc>
-          <w:tcPr>
-            <w:tcW w:w="3080" w:type="dxa"/>
-          </w:tcPr>
-          <w:p>
-            <w:pPr>
-              <w:rPr>
-                <w:b/>
-                <w:bCs/>
-                <w:lang w:val="en-US"/>
-              </w:rPr>
-            </w:pPr>
-            <w:proofErr w:type="spellStart"/>
-            <w:r>
-              <w:rPr>
-                <w:b/>
-                <w:bCs/>
-                <w:lang w:val="en-US"/>
-              </w:rPr>
-              <w:t>Venkata</w:t>
-            </w:r>
-            <w:proofErr w:type="spellEnd"/>
-            <w:r>
-              <w:rPr>
-                <w:b/>
-                <w:bCs/>
-                <w:lang w:val="en-US"/>
-              </w:rPr>
-              <w:t xml:space="preserve"> </w:t>
-            </w:r>
-            <w:proofErr w:type="spellStart"/>
-            <w:r>
-              <w:rPr>
-                <w:b/>
-                <w:bCs/>
-                <w:lang w:val="en-US"/>
-              </w:rPr>
-              <w:t>Sai</w:t>
-            </w:r>
-            <w:proofErr w:type="spellEnd"/>
-            <w:r>
-              <w:rPr>
-                <w:b/>
-                <w:bCs/>
-                <w:lang w:val="en-US"/>
-              </w:rPr>
-              <w:t xml:space="preserve"> Kumar G </w:t>
-            </w:r>
-          </w:p>
-        </w:tc>
-        <w:tc>
-          <w:tcPr>
-            <w:tcW w:w="3081" w:type="dxa"/>
-          </w:tcPr>
-          <w:p>
-            <w:pPr>
-              <w:rPr>
-                <w:b/>
-                <w:bCs/>
-                <w:lang w:val="en-US"/>
-              </w:rPr>
-            </w:pPr>
-            <w:r>
-              <w:rPr>
-                <w:b/>
-                <w:bCs/>
-                <w:lang w:val="en-US"/>
-              </w:rPr>
-              <w:t>2024AA05749</w:t>
-            </w:r>
-          </w:p>
-        </w:tc>
-        <w:tc>
-          <w:tcPr>
-            <w:tcW w:w="3081" w:type="dxa"/>
-          </w:tcPr>
-          <w:p>
-            <w:pPr>
-              <w:rPr>
-                <w:b/>
-                <w:bCs/>
-                <w:lang w:val="en-US"/>
-              </w:rPr>
-            </w:pPr>
-            <w:r>
-              <w:rPr>
-                <w:b/>
-                <w:bCs/>
-                <w:lang w:val="en-US"/>
-              </w:rPr>
-              <w:t xml:space="preserve">100% </w:t>
-            </w:r>
-          </w:p>
-        </w:tc>
-      </w:tr>
-      <w:tr>
-        <w:tc>
-          <w:tcPr>
-            <w:tcW w:w="3080" w:type="dxa"/>
-          </w:tcPr>
-          <w:p>
-            <w:pPr>
-              <w:rPr>
-                <w:b/>
-                <w:bCs/>
-                <w:lang w:val="en-US"/>
-              </w:rPr>
-            </w:pPr>
-            <w:proofErr w:type="spellStart"/>
-            <w:r>
-              <w:rPr>
-                <w:b/>
-                <w:bCs/>
-                <w:lang w:val="en-US"/>
-              </w:rPr>
-              <w:t>Kattamuri</w:t>
-            </w:r>
-            <w:proofErr w:type="spellEnd"/>
-            <w:r>
-              <w:rPr>
-                <w:b/>
-                <w:bCs/>
-                <w:lang w:val="en-US"/>
-              </w:rPr>
-              <w:t xml:space="preserve"> Sunil Kumar</w:t>
-            </w:r>
-          </w:p>
-        </w:tc>
-        <w:tc>
-          <w:tcPr>
-            <w:tcW w:w="3081" w:type="dxa"/>
-          </w:tcPr>
-          <w:p>
-            <w:pPr>
-              <w:rPr>
-                <w:b/>
-                <w:bCs/>
-                <w:lang w:val="en-US"/>
-              </w:rPr>
-            </w:pPr>
-            <w:r>
-              <w:rPr>
-                <w:b/>
-                <w:bCs/>
-                <w:lang w:val="en-US"/>
-              </w:rPr>
-              <w:t>2024AA05522</w:t>
-            </w:r>
-          </w:p>
-        </w:tc>
-        <w:tc>
-          <w:tcPr>
-            <w:tcW w:w="3081" w:type="dxa"/>
-          </w:tcPr>
-          <w:p>
-            <w:pPr>
-              <w:rPr>
-                <w:b/>
-                <w:bCs/>
-                <w:lang w:val="en-US"/>
-              </w:rPr>
-            </w:pPr>
-            <w:r>
-              <w:rPr>
-                <w:b/>
-                <w:bCs/>
-                <w:lang w:val="en-US"/>
-              </w:rPr>
-              <w:t>100%</w:t>
-            </w:r>
-          </w:p>
-        </w:tc>
-      </w:tr>
-      <w:tr>
-        <w:tc>
-          <w:tcPr>
-            <w:tcW w:w="3080" w:type="dxa"/>
-          </w:tcPr>
-          <w:p>
-            <w:pPr>
-              <w:rPr>
-                <w:b/>
-                <w:bCs/>
-                <w:lang w:val="en-US"/>
-              </w:rPr>
-            </w:pPr>
-            <w:r>
-              <w:rPr>
-                <w:b/>
-                <w:bCs/>
-                <w:lang w:val="en-US"/>
-              </w:rPr>
-              <w:t xml:space="preserve">K </w:t>
-            </w:r>
-            <w:proofErr w:type="spellStart"/>
-            <w:r>
-              <w:rPr>
-                <w:b/>
-                <w:bCs/>
-                <w:lang w:val="en-US"/>
-              </w:rPr>
-              <w:t>Kalyan</w:t>
-            </w:r>
-            <w:proofErr w:type="spellEnd"/>
-            <w:r>
-              <w:rPr>
-                <w:b/>
-                <w:bCs/>
-                <w:lang w:val="en-US"/>
-              </w:rPr>
-              <w:t xml:space="preserve"> Kumar</w:t>
-            </w:r>
-          </w:p>
-        </w:tc>
-        <w:tc>
-          <w:tcPr>
-            <w:tcW w:w="3081" w:type="dxa"/>
-          </w:tcPr>
-          <w:p>
-            <w:pPr>
-              <w:rPr>
-                <w:b/>
-                <w:bCs/>
-                <w:lang w:val="en-US"/>
-              </w:rPr>
-            </w:pPr>
-            <w:r>
-              <w:rPr>
-                <w:b/>
-                <w:bCs/>
-                <w:lang w:val="en-US"/>
-              </w:rPr>
-              <w:t>2024AA05751</w:t>
-            </w:r>
-          </w:p>
-        </w:tc>
-        <w:tc>
-          <w:tcPr>
-            <w:tcW w:w="3081" w:type="dxa"/>
-          </w:tcPr>
-          <w:p>
-            <w:pPr>
-              <w:rPr>
-                <w:b/>
-                <w:bCs/>
-                <w:lang w:val="en-US"/>
-              </w:rPr>
-            </w:pPr>
-            <w:r>
-              <w:rPr>
-                <w:b/>
-                <w:bCs/>
-                <w:lang w:val="en-US"/>
-              </w:rPr>
-              <w:t>100%</w:t>
-            </w:r>
-          </w:p>
-        </w:tc>
-      </w:tr>
-      <w:tr>
-        <w:tc>
-          <w:tcPr>
-            <w:tcW w:w="3080" w:type="dxa"/>
-          </w:tcPr>
-          <w:p>
-            <w:pPr>
-              <w:rPr>
-                <w:b/>
-                <w:bCs/>
-                <w:lang w:val="en-US"/>
-              </w:rPr>
-            </w:pPr>
-            <w:proofErr w:type="spellStart"/>
-            <w:r>
-              <w:rPr>
-                <w:b/>
-                <w:bCs/>
-                <w:lang w:val="en-US"/>
-              </w:rPr>
-              <w:t>Rohith</w:t>
-            </w:r>
-            <w:proofErr w:type="spellEnd"/>
-            <w:r>
-              <w:rPr>
-                <w:b/>
-                <w:bCs/>
-                <w:lang w:val="en-US"/>
-              </w:rPr>
-              <w:t xml:space="preserve"> </w:t>
-            </w:r>
-            <w:proofErr w:type="spellStart"/>
-            <w:r>
-              <w:rPr>
-                <w:b/>
-                <w:bCs/>
-                <w:lang w:val="en-US"/>
-              </w:rPr>
-              <w:t>Annadanam</w:t>
-            </w:r>
-            <w:proofErr w:type="spellEnd"/>
-          </w:p>
-        </w:tc>
-        <w:tc>
-          <w:tcPr>
-            <w:tcW w:w="3081" w:type="dxa"/>
-          </w:tcPr>
-          <w:p>
-            <w:pPr>
-              <w:rPr>
-                <w:b/>
-                <w:bCs/>
-                <w:lang w:val="en-US"/>
-              </w:rPr>
-            </w:pPr>
-            <w:r>
-              <w:rPr>
-                <w:b/>
-                <w:bCs/>
-                <w:lang w:val="en-US"/>
-              </w:rPr>
-              <w:t>2024AA05888</w:t>
-            </w:r>
-          </w:p>
-        </w:tc>
-        <w:tc>
-          <w:tcPr>
-            <w:tcW w:w="3081" w:type="dxa"/>
-          </w:tcPr>
-          <w:p>
-            <w:pPr>
-              <w:rPr>
-                <w:b/>
-                <w:bCs/>
-                <w:lang w:val="en-US"/>
-              </w:rPr>
-            </w:pPr>
-            <w:r>
-              <w:rPr>
-                <w:b/>
-                <w:bCs/>
-                <w:lang w:val="en-US"/>
-              </w:rPr>
-              <w:t>100%</w:t>
-            </w:r>
-          </w:p>
-        </w:tc>
-      </w:tr>
-    </w:tbl>
-    <w:p>
-      <w:pPr>
-        <w:rPr>
-          <w:b/>
-          <w:bCs/>
-          <w:lang w:val="en-US"/>
-        </w:rPr>
-      </w:pPr>
-    </w:p>
-    <w:p>
-      <w:pPr>
         <w:rPr>
           <w:b/>
           <w:bCs/>
@@ -1093,6 +554,7 @@
           <w:bCs/>
           <w:lang w:val="en-US"/>
         </w:rPr>
+        <w:lastRenderedPageBreak/>
         <w:t>Random URLs</w:t>
       </w:r>
       <w:r>
@@ -10826,6 +10288,7 @@
   <w:style w:type="character" w:default="1" w:styleId="DefaultParagraphFont">
     <w:name w:val="Default Paragraph Font"/>
     <w:uiPriority w:val="1"/>
+    <w:semiHidden/>
     <w:unhideWhenUsed/>
   </w:style>
   <w:style w:type="table" w:default="1" w:styleId="TableNormal">
@@ -11265,7 +10728,7 @@
   <a:extraClrSchemeLst/>
   <a:extLst>
     <a:ext uri="{05A4C25C-085E-4340-85A3-A5531E510DB2}">
-      <thm15:themeFamily xmlns:thm15="http://schemas.microsoft.com/office/thememl/2012/main" xmlns="" name="Office Theme" id="{62F939B6-93AF-4DB8-9C6B-D6C7DFDC589F}" vid="{4A3C46E8-61CC-4603-A589-7422A47A8E4A}"/>
+      <thm15:themeFamily xmlns="" xmlns:thm15="http://schemas.microsoft.com/office/thememl/2012/main" name="Office Theme" id="{62F939B6-93AF-4DB8-9C6B-D6C7DFDC589F}" vid="{4A3C46E8-61CC-4603-A589-7422A47A8E4A}"/>
     </a:ext>
   </a:extLst>
 </a:theme>

</xml_diff>